<commit_message>
feat: add table-based Word templates and update import UI for annotated and multiple-choice exams
</commit_message>
<xml_diff>
--- a/templates/exam_import_template_annotated.docx
+++ b/templates/exam_import_template_annotated.docx
@@ -6,12 +6,11 @@
       <w:pPr>
         <w:spacing w:after="0"/>
         <w:rPr>
-          <w:rFonts w:ascii="TH SarabunPSK" w:hAnsi="TH SarabunPSK" w:cs="TH SarabunPSK" w:hint="cs"/>
+          <w:rFonts w:ascii="TH SarabunPSK" w:hAnsi="TH SarabunPSK" w:cs="TH SarabunPSK"/>
           <w:sz w:val="36"/>
           <w:szCs w:val="36"/>
         </w:rPr>
       </w:pPr>
-      <w:proofErr w:type="spellStart"/>
       <w:r>
         <w:rPr>
           <w:rFonts w:ascii="TH SarabunPSK" w:hAnsi="TH SarabunPSK" w:cs="TH SarabunPSK" w:hint="cs"/>
@@ -20,32 +19,20 @@
           <w:sz w:val="36"/>
           <w:szCs w:val="36"/>
         </w:rPr>
-        <w:t>ตัวอย่างการพิมพ์ข้อสอบแบบอัตนัย</w:t>
-      </w:r>
-      <w:proofErr w:type="spellEnd"/>
-      <w:r>
-        <w:rPr>
-          <w:rFonts w:ascii="TH SarabunPSK" w:hAnsi="TH SarabunPSK" w:cs="TH SarabunPSK" w:hint="cs"/>
-          <w:b/>
-          <w:color w:val="0070C0"/>
-          <w:sz w:val="36"/>
-          <w:szCs w:val="36"/>
-        </w:rPr>
-        <w:t xml:space="preserve"> (Subjective Template)</w:t>
+        <w:t>ตัวอย่างการพิมพ์ข้อสอบแบบอัตนัย (Subjective Template)</w:t>
       </w:r>
     </w:p>
     <w:p>
       <w:pPr>
         <w:spacing w:after="0"/>
         <w:rPr>
-          <w:rFonts w:ascii="TH SarabunPSK" w:hAnsi="TH SarabunPSK" w:cs="TH SarabunPSK" w:hint="cs"/>
+          <w:rFonts w:ascii="TH SarabunPSK" w:hAnsi="TH SarabunPSK" w:cs="TH SarabunPSK"/>
           <w:b/>
           <w:bCs/>
           <w:sz w:val="28"/>
           <w:szCs w:val="28"/>
         </w:rPr>
       </w:pPr>
-      <w:proofErr w:type="spellStart"/>
       <w:r>
         <w:rPr>
           <w:rFonts w:ascii="TH SarabunPSK" w:hAnsi="TH SarabunPSK" w:cs="TH SarabunPSK" w:hint="cs"/>
@@ -55,146 +42,14 @@
           <w:sz w:val="28"/>
           <w:szCs w:val="28"/>
         </w:rPr>
-        <w:t>คำแนะนำ</w:t>
-      </w:r>
-      <w:proofErr w:type="spellEnd"/>
-      <w:r>
-        <w:rPr>
-          <w:rFonts w:ascii="TH SarabunPSK" w:hAnsi="TH SarabunPSK" w:cs="TH SarabunPSK" w:hint="cs"/>
-          <w:b/>
-          <w:bCs/>
-          <w:color w:val="595959"/>
-          <w:sz w:val="28"/>
-          <w:szCs w:val="28"/>
-        </w:rPr>
-        <w:t xml:space="preserve">: </w:t>
-      </w:r>
-      <w:proofErr w:type="spellStart"/>
-      <w:r>
-        <w:rPr>
-          <w:rFonts w:ascii="TH SarabunPSK" w:hAnsi="TH SarabunPSK" w:cs="TH SarabunPSK" w:hint="cs"/>
-          <w:b/>
-          <w:bCs/>
-          <w:color w:val="595959"/>
-          <w:sz w:val="28"/>
-          <w:szCs w:val="28"/>
-        </w:rPr>
-        <w:t>พิมพ์โจทย์เรียงข้อ</w:t>
-      </w:r>
-      <w:proofErr w:type="spellEnd"/>
-      <w:r>
-        <w:rPr>
-          <w:rFonts w:ascii="TH SarabunPSK" w:hAnsi="TH SarabunPSK" w:cs="TH SarabunPSK" w:hint="cs"/>
-          <w:b/>
-          <w:bCs/>
-          <w:color w:val="595959"/>
-          <w:sz w:val="28"/>
-          <w:szCs w:val="28"/>
-        </w:rPr>
-        <w:t xml:space="preserve"> (1. 2. 3...) </w:t>
-      </w:r>
-      <w:proofErr w:type="spellStart"/>
-      <w:r>
-        <w:rPr>
-          <w:rFonts w:ascii="TH SarabunPSK" w:hAnsi="TH SarabunPSK" w:cs="TH SarabunPSK" w:hint="cs"/>
-          <w:b/>
-          <w:bCs/>
-          <w:color w:val="595959"/>
-          <w:sz w:val="28"/>
-          <w:szCs w:val="28"/>
-        </w:rPr>
-        <w:t>ตามด้วยบรรทัดแนวทางการตอบ</w:t>
-      </w:r>
-      <w:proofErr w:type="spellEnd"/>
-      <w:r>
-        <w:rPr>
-          <w:rFonts w:ascii="TH SarabunPSK" w:hAnsi="TH SarabunPSK" w:cs="TH SarabunPSK" w:hint="cs"/>
-          <w:b/>
-          <w:bCs/>
-          <w:color w:val="595959"/>
-          <w:sz w:val="28"/>
-          <w:szCs w:val="28"/>
-        </w:rPr>
-        <w:t xml:space="preserve"> "</w:t>
-      </w:r>
-      <w:proofErr w:type="spellStart"/>
-      <w:r>
-        <w:rPr>
-          <w:rFonts w:ascii="TH SarabunPSK" w:hAnsi="TH SarabunPSK" w:cs="TH SarabunPSK" w:hint="cs"/>
-          <w:b/>
-          <w:bCs/>
-          <w:color w:val="595959"/>
-          <w:sz w:val="28"/>
-          <w:szCs w:val="28"/>
-        </w:rPr>
-        <w:t>ตอบ</w:t>
-      </w:r>
-      <w:proofErr w:type="spellEnd"/>
-      <w:r>
-        <w:rPr>
-          <w:rFonts w:ascii="TH SarabunPSK" w:hAnsi="TH SarabunPSK" w:cs="TH SarabunPSK" w:hint="cs"/>
-          <w:b/>
-          <w:bCs/>
-          <w:color w:val="595959"/>
-          <w:sz w:val="28"/>
-          <w:szCs w:val="28"/>
-        </w:rPr>
-        <w:t xml:space="preserve">: ..." </w:t>
-      </w:r>
-      <w:proofErr w:type="spellStart"/>
-      <w:r>
-        <w:rPr>
-          <w:rFonts w:ascii="TH SarabunPSK" w:hAnsi="TH SarabunPSK" w:cs="TH SarabunPSK" w:hint="cs"/>
-          <w:b/>
-          <w:bCs/>
-          <w:color w:val="595959"/>
-          <w:sz w:val="28"/>
-          <w:szCs w:val="28"/>
-        </w:rPr>
-        <w:t>หรือ</w:t>
-      </w:r>
-      <w:proofErr w:type="spellEnd"/>
-      <w:r>
-        <w:rPr>
-          <w:rFonts w:ascii="TH SarabunPSK" w:hAnsi="TH SarabunPSK" w:cs="TH SarabunPSK" w:hint="cs"/>
-          <w:b/>
-          <w:bCs/>
-          <w:color w:val="595959"/>
-          <w:sz w:val="28"/>
-          <w:szCs w:val="28"/>
-        </w:rPr>
-        <w:t xml:space="preserve"> "</w:t>
-      </w:r>
-      <w:proofErr w:type="spellStart"/>
-      <w:r>
-        <w:rPr>
-          <w:rFonts w:ascii="TH SarabunPSK" w:hAnsi="TH SarabunPSK" w:cs="TH SarabunPSK" w:hint="cs"/>
-          <w:b/>
-          <w:bCs/>
-          <w:color w:val="595959"/>
-          <w:sz w:val="28"/>
-          <w:szCs w:val="28"/>
-        </w:rPr>
-        <w:t>เฉลย</w:t>
-      </w:r>
-      <w:proofErr w:type="spellEnd"/>
-      <w:r>
-        <w:rPr>
-          <w:rFonts w:ascii="TH SarabunPSK" w:hAnsi="TH SarabunPSK" w:cs="TH SarabunPSK" w:hint="cs"/>
-          <w:b/>
-          <w:bCs/>
-          <w:color w:val="595959"/>
-          <w:sz w:val="28"/>
-          <w:szCs w:val="28"/>
-        </w:rPr>
-        <w:t>: ..."</w:t>
+        <w:t>คำแนะนำ: พิมพ์โจทย์เรียงข้อ (1. 2. 3...) ตามด้วยบรรทัดแนวทางการตอบ "ตอบ: ..." หรือ "เฉลย: ..."</w:t>
       </w:r>
     </w:p>
     <w:p>
       <w:pPr>
         <w:spacing w:after="0"/>
         <w:rPr>
-          <w:rFonts w:ascii="TH SarabunPSK" w:hAnsi="TH SarabunPSK" w:cs="TH SarabunPSK" w:hint="cs"/>
+          <w:rFonts w:ascii="TH SarabunPSK" w:hAnsi="TH SarabunPSK" w:cs="TH SarabunPSK"/>
           <w:sz w:val="28"/>
           <w:szCs w:val="28"/>
         </w:rPr>
@@ -204,255 +59,46 @@
       <w:pPr>
         <w:spacing w:after="0"/>
         <w:rPr>
+          <w:rFonts w:ascii="TH SarabunPSK" w:hAnsi="TH SarabunPSK" w:cs="TH SarabunPSK"/>
+          <w:sz w:val="28"/>
+          <w:szCs w:val="28"/>
+        </w:rPr>
+      </w:pPr>
+      <w:r>
+        <w:rPr>
           <w:rFonts w:ascii="TH SarabunPSK" w:hAnsi="TH SarabunPSK" w:cs="TH SarabunPSK" w:hint="cs"/>
-          <w:sz w:val="28"/>
-          <w:szCs w:val="28"/>
-        </w:rPr>
-      </w:pPr>
-      <w:r>
-        <w:rPr>
-          <w:rFonts w:ascii="TH SarabunPSK" w:hAnsi="TH SarabunPSK" w:cs="TH SarabunPSK" w:hint="cs"/>
-          <w:b/>
-          <w:sz w:val="28"/>
-          <w:szCs w:val="28"/>
-        </w:rPr>
-        <w:t xml:space="preserve">1. </w:t>
+          <w:b/>
+          <w:sz w:val="28"/>
+          <w:szCs w:val="28"/>
+        </w:rPr>
+        <w:t>1. จงอธิบายความหมายและคุณประโยชน์ของระบบสารสนเทศเพื่อการจัดการ (MIS) มาพอสังเขป</w:t>
       </w:r>
-      <w:proofErr w:type="spellStart"/>
-      <w:r>
-        <w:rPr>
-          <w:rFonts w:ascii="TH SarabunPSK" w:hAnsi="TH SarabunPSK" w:cs="TH SarabunPSK" w:hint="cs"/>
-          <w:b/>
-          <w:sz w:val="28"/>
-          <w:szCs w:val="28"/>
-        </w:rPr>
-        <w:t>จงอธิบายความหมายและคุณประโยชน์ของระบบสารสนเทศเพื่อการจัดการ</w:t>
-      </w:r>
-      <w:proofErr w:type="spellEnd"/>
-      <w:r>
-        <w:rPr>
-          <w:rFonts w:ascii="TH SarabunPSK" w:hAnsi="TH SarabunPSK" w:cs="TH SarabunPSK" w:hint="cs"/>
-          <w:b/>
-          <w:sz w:val="28"/>
-          <w:szCs w:val="28"/>
-        </w:rPr>
-        <w:t xml:space="preserve"> (MIS) </w:t>
-      </w:r>
-      <w:proofErr w:type="spellStart"/>
-      <w:r>
-        <w:rPr>
-          <w:rFonts w:ascii="TH SarabunPSK" w:hAnsi="TH SarabunPSK" w:cs="TH SarabunPSK" w:hint="cs"/>
-          <w:b/>
-          <w:sz w:val="28"/>
-          <w:szCs w:val="28"/>
-        </w:rPr>
-        <w:t>มาพอสังเขป</w:t>
-      </w:r>
-      <w:proofErr w:type="spellEnd"/>
     </w:p>
     <w:p>
       <w:pPr>
         <w:spacing w:after="0"/>
         <w:rPr>
+          <w:rFonts w:ascii="TH SarabunPSK" w:hAnsi="TH SarabunPSK" w:cs="TH SarabunPSK"/>
+          <w:sz w:val="28"/>
+          <w:szCs w:val="28"/>
+        </w:rPr>
+      </w:pPr>
+      <w:r>
+        <w:rPr>
           <w:rFonts w:ascii="TH SarabunPSK" w:hAnsi="TH SarabunPSK" w:cs="TH SarabunPSK" w:hint="cs"/>
-          <w:sz w:val="28"/>
-          <w:szCs w:val="28"/>
-        </w:rPr>
-      </w:pPr>
-      <w:proofErr w:type="spellStart"/>
-      <w:r>
-        <w:rPr>
-          <w:rFonts w:ascii="TH SarabunPSK" w:hAnsi="TH SarabunPSK" w:cs="TH SarabunPSK" w:hint="cs"/>
           <w:b/>
           <w:color w:val="008000"/>
           <w:sz w:val="28"/>
           <w:szCs w:val="28"/>
         </w:rPr>
-        <w:t>ตอบ</w:t>
+        <w:t>ตอบ: ระบบสารสนเทศเพื่อการจัดการ (MIS) คือ ระบบที่รวบรวม ประมวลผล และจัดเก็บข้อมูล เพื่อนำมาใช้ในการวางแผน การตัดสินใจ และการบริหารจัดการองค์กรได้อย่างมีประสิทธิภาพ</w:t>
       </w:r>
-      <w:proofErr w:type="spellEnd"/>
-      <w:r>
-        <w:rPr>
-          <w:rFonts w:ascii="TH SarabunPSK" w:hAnsi="TH SarabunPSK" w:cs="TH SarabunPSK" w:hint="cs"/>
-          <w:b/>
-          <w:color w:val="008000"/>
-          <w:sz w:val="28"/>
-          <w:szCs w:val="28"/>
-        </w:rPr>
-        <w:t xml:space="preserve">: </w:t>
-      </w:r>
-      <w:proofErr w:type="spellStart"/>
-      <w:r>
-        <w:rPr>
-          <w:rFonts w:ascii="TH SarabunPSK" w:hAnsi="TH SarabunPSK" w:cs="TH SarabunPSK" w:hint="cs"/>
-          <w:b/>
-          <w:color w:val="008000"/>
-          <w:sz w:val="28"/>
-          <w:szCs w:val="28"/>
-        </w:rPr>
-        <w:t>ระบบสารสนเทศเพื่อการจัดการ</w:t>
-      </w:r>
-      <w:proofErr w:type="spellEnd"/>
-      <w:r>
-        <w:rPr>
-          <w:rFonts w:ascii="TH SarabunPSK" w:hAnsi="TH SarabunPSK" w:cs="TH SarabunPSK" w:hint="cs"/>
-          <w:b/>
-          <w:color w:val="008000"/>
-          <w:sz w:val="28"/>
-          <w:szCs w:val="28"/>
-        </w:rPr>
-        <w:t xml:space="preserve"> (MIS) </w:t>
-      </w:r>
-      <w:proofErr w:type="spellStart"/>
-      <w:r>
-        <w:rPr>
-          <w:rFonts w:ascii="TH SarabunPSK" w:hAnsi="TH SarabunPSK" w:cs="TH SarabunPSK" w:hint="cs"/>
-          <w:b/>
-          <w:color w:val="008000"/>
-          <w:sz w:val="28"/>
-          <w:szCs w:val="28"/>
-        </w:rPr>
-        <w:t>คือ</w:t>
-      </w:r>
-      <w:proofErr w:type="spellEnd"/>
-      <w:r>
-        <w:rPr>
-          <w:rFonts w:ascii="TH SarabunPSK" w:hAnsi="TH SarabunPSK" w:cs="TH SarabunPSK" w:hint="cs"/>
-          <w:b/>
-          <w:color w:val="008000"/>
-          <w:sz w:val="28"/>
-          <w:szCs w:val="28"/>
-        </w:rPr>
-        <w:t xml:space="preserve"> </w:t>
-      </w:r>
-      <w:proofErr w:type="spellStart"/>
-      <w:r>
-        <w:rPr>
-          <w:rFonts w:ascii="TH SarabunPSK" w:hAnsi="TH SarabunPSK" w:cs="TH SarabunPSK" w:hint="cs"/>
-          <w:b/>
-          <w:color w:val="008000"/>
-          <w:sz w:val="28"/>
-          <w:szCs w:val="28"/>
-        </w:rPr>
-        <w:t>ระบบที่รวบรวม</w:t>
-      </w:r>
-      <w:proofErr w:type="spellEnd"/>
-      <w:r>
-        <w:rPr>
-          <w:rFonts w:ascii="TH SarabunPSK" w:hAnsi="TH SarabunPSK" w:cs="TH SarabunPSK" w:hint="cs"/>
-          <w:b/>
-          <w:color w:val="008000"/>
-          <w:sz w:val="28"/>
-          <w:szCs w:val="28"/>
-        </w:rPr>
-        <w:t xml:space="preserve"> </w:t>
-      </w:r>
-      <w:proofErr w:type="spellStart"/>
-      <w:r>
-        <w:rPr>
-          <w:rFonts w:ascii="TH SarabunPSK" w:hAnsi="TH SarabunPSK" w:cs="TH SarabunPSK" w:hint="cs"/>
-          <w:b/>
-          <w:color w:val="008000"/>
-          <w:sz w:val="28"/>
-          <w:szCs w:val="28"/>
-        </w:rPr>
-        <w:t>ประมวลผล</w:t>
-      </w:r>
-      <w:proofErr w:type="spellEnd"/>
-      <w:r>
-        <w:rPr>
-          <w:rFonts w:ascii="TH SarabunPSK" w:hAnsi="TH SarabunPSK" w:cs="TH SarabunPSK" w:hint="cs"/>
-          <w:b/>
-          <w:color w:val="008000"/>
-          <w:sz w:val="28"/>
-          <w:szCs w:val="28"/>
-        </w:rPr>
-        <w:t xml:space="preserve"> </w:t>
-      </w:r>
-      <w:proofErr w:type="spellStart"/>
-      <w:r>
-        <w:rPr>
-          <w:rFonts w:ascii="TH SarabunPSK" w:hAnsi="TH SarabunPSK" w:cs="TH SarabunPSK" w:hint="cs"/>
-          <w:b/>
-          <w:color w:val="008000"/>
-          <w:sz w:val="28"/>
-          <w:szCs w:val="28"/>
-        </w:rPr>
-        <w:t>และจัดเก็บข้อมูล</w:t>
-      </w:r>
-      <w:proofErr w:type="spellEnd"/>
-      <w:r>
-        <w:rPr>
-          <w:rFonts w:ascii="TH SarabunPSK" w:hAnsi="TH SarabunPSK" w:cs="TH SarabunPSK" w:hint="cs"/>
-          <w:b/>
-          <w:color w:val="008000"/>
-          <w:sz w:val="28"/>
-          <w:szCs w:val="28"/>
-        </w:rPr>
-        <w:t xml:space="preserve"> </w:t>
-      </w:r>
-      <w:proofErr w:type="spellStart"/>
-      <w:r>
-        <w:rPr>
-          <w:rFonts w:ascii="TH SarabunPSK" w:hAnsi="TH SarabunPSK" w:cs="TH SarabunPSK" w:hint="cs"/>
-          <w:b/>
-          <w:color w:val="008000"/>
-          <w:sz w:val="28"/>
-          <w:szCs w:val="28"/>
-        </w:rPr>
-        <w:t>เพื่อนำมาใช้ในการวางแผน</w:t>
-      </w:r>
-      <w:proofErr w:type="spellEnd"/>
-      <w:r>
-        <w:rPr>
-          <w:rFonts w:ascii="TH SarabunPSK" w:hAnsi="TH SarabunPSK" w:cs="TH SarabunPSK" w:hint="cs"/>
-          <w:b/>
-          <w:color w:val="008000"/>
-          <w:sz w:val="28"/>
-          <w:szCs w:val="28"/>
-        </w:rPr>
-        <w:t xml:space="preserve"> </w:t>
-      </w:r>
-      <w:proofErr w:type="spellStart"/>
-      <w:r>
-        <w:rPr>
-          <w:rFonts w:ascii="TH SarabunPSK" w:hAnsi="TH SarabunPSK" w:cs="TH SarabunPSK" w:hint="cs"/>
-          <w:b/>
-          <w:color w:val="008000"/>
-          <w:sz w:val="28"/>
-          <w:szCs w:val="28"/>
-        </w:rPr>
-        <w:t>การตัดสินใจ</w:t>
-      </w:r>
-      <w:proofErr w:type="spellEnd"/>
-      <w:r>
-        <w:rPr>
-          <w:rFonts w:ascii="TH SarabunPSK" w:hAnsi="TH SarabunPSK" w:cs="TH SarabunPSK" w:hint="cs"/>
-          <w:b/>
-          <w:color w:val="008000"/>
-          <w:sz w:val="28"/>
-          <w:szCs w:val="28"/>
-        </w:rPr>
-        <w:t xml:space="preserve"> </w:t>
-      </w:r>
-      <w:proofErr w:type="spellStart"/>
-      <w:r>
-        <w:rPr>
-          <w:rFonts w:ascii="TH SarabunPSK" w:hAnsi="TH SarabunPSK" w:cs="TH SarabunPSK" w:hint="cs"/>
-          <w:b/>
-          <w:color w:val="008000"/>
-          <w:sz w:val="28"/>
-          <w:szCs w:val="28"/>
-        </w:rPr>
-        <w:t>และการบริหารจัดการองค์กรได้อย่างมีประสิทธิภาพ</w:t>
-      </w:r>
-      <w:proofErr w:type="spellEnd"/>
     </w:p>
     <w:p>
       <w:pPr>
         <w:spacing w:after="0"/>
         <w:rPr>
-          <w:rFonts w:ascii="TH SarabunPSK" w:hAnsi="TH SarabunPSK" w:cs="TH SarabunPSK" w:hint="cs"/>
+          <w:rFonts w:ascii="TH SarabunPSK" w:hAnsi="TH SarabunPSK" w:cs="TH SarabunPSK"/>
           <w:sz w:val="28"/>
           <w:szCs w:val="28"/>
         </w:rPr>
@@ -462,82 +108,54 @@
       <w:pPr>
         <w:spacing w:after="0"/>
         <w:rPr>
+          <w:rFonts w:ascii="TH SarabunPSK" w:hAnsi="TH SarabunPSK" w:cs="TH SarabunPSK"/>
+          <w:sz w:val="28"/>
+          <w:szCs w:val="28"/>
+        </w:rPr>
+      </w:pPr>
+      <w:r>
+        <w:rPr>
           <w:rFonts w:ascii="TH SarabunPSK" w:hAnsi="TH SarabunPSK" w:cs="TH SarabunPSK" w:hint="cs"/>
-          <w:sz w:val="28"/>
-          <w:szCs w:val="28"/>
-        </w:rPr>
-      </w:pPr>
-      <w:r>
-        <w:rPr>
-          <w:rFonts w:ascii="TH SarabunPSK" w:hAnsi="TH SarabunPSK" w:cs="TH SarabunPSK" w:hint="cs"/>
-          <w:b/>
-          <w:sz w:val="28"/>
-          <w:szCs w:val="28"/>
-        </w:rPr>
-        <w:t xml:space="preserve">2. </w:t>
+          <w:b/>
+          <w:sz w:val="28"/>
+          <w:szCs w:val="28"/>
+        </w:rPr>
+        <w:t>2. จงยกตัวอย่างองค์ประกอบพื้นฐานของคอมพิวเตอร์ (Hardware) มาอย่างน้อย 3 ประการ</w:t>
       </w:r>
-      <w:proofErr w:type="spellStart"/>
-      <w:r>
-        <w:rPr>
-          <w:rFonts w:ascii="TH SarabunPSK" w:hAnsi="TH SarabunPSK" w:cs="TH SarabunPSK" w:hint="cs"/>
-          <w:b/>
-          <w:sz w:val="28"/>
-          <w:szCs w:val="28"/>
-        </w:rPr>
-        <w:t>จงยกตัวอย่างองค์ประกอบพื้นฐานของคอมพิวเตอร์</w:t>
-      </w:r>
-      <w:proofErr w:type="spellEnd"/>
-      <w:r>
-        <w:rPr>
-          <w:rFonts w:ascii="TH SarabunPSK" w:hAnsi="TH SarabunPSK" w:cs="TH SarabunPSK" w:hint="cs"/>
-          <w:b/>
-          <w:sz w:val="28"/>
-          <w:szCs w:val="28"/>
-        </w:rPr>
-        <w:t xml:space="preserve"> (Hardware) </w:t>
-      </w:r>
-      <w:proofErr w:type="spellStart"/>
-      <w:r>
-        <w:rPr>
-          <w:rFonts w:ascii="TH SarabunPSK" w:hAnsi="TH SarabunPSK" w:cs="TH SarabunPSK" w:hint="cs"/>
-          <w:b/>
-          <w:sz w:val="28"/>
-          <w:szCs w:val="28"/>
-        </w:rPr>
-        <w:t>มาอย่างน้อย</w:t>
-      </w:r>
-      <w:proofErr w:type="spellEnd"/>
-      <w:r>
-        <w:rPr>
-          <w:rFonts w:ascii="TH SarabunPSK" w:hAnsi="TH SarabunPSK" w:cs="TH SarabunPSK" w:hint="cs"/>
-          <w:b/>
-          <w:sz w:val="28"/>
-          <w:szCs w:val="28"/>
-        </w:rPr>
-        <w:t xml:space="preserve"> 3 </w:t>
-      </w:r>
-      <w:proofErr w:type="spellStart"/>
-      <w:r>
-        <w:rPr>
-          <w:rFonts w:ascii="TH SarabunPSK" w:hAnsi="TH SarabunPSK" w:cs="TH SarabunPSK" w:hint="cs"/>
-          <w:b/>
-          <w:sz w:val="28"/>
-          <w:szCs w:val="28"/>
-        </w:rPr>
-        <w:t>ประการ</w:t>
-      </w:r>
-      <w:proofErr w:type="spellEnd"/>
     </w:p>
     <w:p>
       <w:pPr>
         <w:spacing w:after="0"/>
         <w:rPr>
+          <w:rFonts w:ascii="TH SarabunPSK" w:hAnsi="TH SarabunPSK" w:cs="TH SarabunPSK"/>
+          <w:b/>
+          <w:color w:val="008000"/>
+          <w:sz w:val="28"/>
+          <w:szCs w:val="28"/>
+        </w:rPr>
+      </w:pPr>
+      <w:r>
+        <w:rPr>
           <w:rFonts w:ascii="TH SarabunPSK" w:hAnsi="TH SarabunPSK" w:cs="TH SarabunPSK" w:hint="cs"/>
-          <w:sz w:val="28"/>
-          <w:szCs w:val="28"/>
-        </w:rPr>
-      </w:pPr>
-      <w:proofErr w:type="spellStart"/>
+          <w:b/>
+          <w:color w:val="008000"/>
+          <w:sz w:val="28"/>
+          <w:szCs w:val="28"/>
+        </w:rPr>
+        <w:t xml:space="preserve">ตอบ: 1. หน่วยประมวลผลกลาง (CPU) </w:t>
+      </w:r>
+    </w:p>
+    <w:p>
+      <w:pPr>
+        <w:spacing w:after="0"/>
+        <w:rPr>
+          <w:rFonts w:ascii="TH SarabunPSK" w:hAnsi="TH SarabunPSK" w:cs="TH SarabunPSK"/>
+          <w:b/>
+          <w:color w:val="008000"/>
+          <w:sz w:val="28"/>
+          <w:szCs w:val="28"/>
+        </w:rPr>
+      </w:pPr>
       <w:r>
         <w:rPr>
           <w:rFonts w:ascii="TH SarabunPSK" w:hAnsi="TH SarabunPSK" w:cs="TH SarabunPSK" w:hint="cs"/>
@@ -546,9 +164,18 @@
           <w:sz w:val="28"/>
           <w:szCs w:val="28"/>
         </w:rPr>
-        <w:t>ตอบ</w:t>
+        <w:t xml:space="preserve">2. หน่วยความจำหลัก (RAM) </w:t>
       </w:r>
-      <w:proofErr w:type="spellEnd"/>
+    </w:p>
+    <w:p>
+      <w:pPr>
+        <w:spacing w:after="0"/>
+        <w:rPr>
+          <w:rFonts w:ascii="TH SarabunPSK" w:hAnsi="TH SarabunPSK" w:cs="TH SarabunPSK"/>
+          <w:sz w:val="28"/>
+          <w:szCs w:val="28"/>
+        </w:rPr>
+      </w:pPr>
       <w:r>
         <w:rPr>
           <w:rFonts w:ascii="TH SarabunPSK" w:hAnsi="TH SarabunPSK" w:cs="TH SarabunPSK" w:hint="cs"/>
@@ -557,73 +184,7 @@
           <w:sz w:val="28"/>
           <w:szCs w:val="28"/>
         </w:rPr>
-        <w:t xml:space="preserve">: 1. </w:t>
-      </w:r>
-      <w:proofErr w:type="spellStart"/>
-      <w:r>
-        <w:rPr>
-          <w:rFonts w:ascii="TH SarabunPSK" w:hAnsi="TH SarabunPSK" w:cs="TH SarabunPSK" w:hint="cs"/>
-          <w:b/>
-          <w:color w:val="008000"/>
-          <w:sz w:val="28"/>
-          <w:szCs w:val="28"/>
-        </w:rPr>
-        <w:t>หน่วยประมวลผลกลาง</w:t>
-      </w:r>
-      <w:proofErr w:type="spellEnd"/>
-      <w:r>
-        <w:rPr>
-          <w:rFonts w:ascii="TH SarabunPSK" w:hAnsi="TH SarabunPSK" w:cs="TH SarabunPSK" w:hint="cs"/>
-          <w:b/>
-          <w:color w:val="008000"/>
-          <w:sz w:val="28"/>
-          <w:szCs w:val="28"/>
-        </w:rPr>
-        <w:t xml:space="preserve"> (CPU) 2. </w:t>
-      </w:r>
-      <w:proofErr w:type="spellStart"/>
-      <w:r>
-        <w:rPr>
-          <w:rFonts w:ascii="TH SarabunPSK" w:hAnsi="TH SarabunPSK" w:cs="TH SarabunPSK" w:hint="cs"/>
-          <w:b/>
-          <w:color w:val="008000"/>
-          <w:sz w:val="28"/>
-          <w:szCs w:val="28"/>
-        </w:rPr>
-        <w:t>หน่วยความจำหลัก</w:t>
-      </w:r>
-      <w:proofErr w:type="spellEnd"/>
-      <w:r>
-        <w:rPr>
-          <w:rFonts w:ascii="TH SarabunPSK" w:hAnsi="TH SarabunPSK" w:cs="TH SarabunPSK" w:hint="cs"/>
-          <w:b/>
-          <w:color w:val="008000"/>
-          <w:sz w:val="28"/>
-          <w:szCs w:val="28"/>
-        </w:rPr>
-        <w:t xml:space="preserve"> (RAM) 3. </w:t>
-      </w:r>
-      <w:proofErr w:type="spellStart"/>
-      <w:r>
-        <w:rPr>
-          <w:rFonts w:ascii="TH SarabunPSK" w:hAnsi="TH SarabunPSK" w:cs="TH SarabunPSK" w:hint="cs"/>
-          <w:b/>
-          <w:color w:val="008000"/>
-          <w:sz w:val="28"/>
-          <w:szCs w:val="28"/>
-        </w:rPr>
-        <w:t>อุปกรณ์จัดเก็บข้อมูล</w:t>
-      </w:r>
-      <w:proofErr w:type="spellEnd"/>
-      <w:r>
-        <w:rPr>
-          <w:rFonts w:ascii="TH SarabunPSK" w:hAnsi="TH SarabunPSK" w:cs="TH SarabunPSK" w:hint="cs"/>
-          <w:b/>
-          <w:color w:val="008000"/>
-          <w:sz w:val="28"/>
-          <w:szCs w:val="28"/>
-        </w:rPr>
-        <w:t xml:space="preserve"> (Hard Disk / SSD)</w:t>
+        <w:t>3. อุปกรณ์จัดเก็บข้อมูล (Hard Disk / SSD)</w:t>
       </w:r>
     </w:p>
     <w:sectPr>
@@ -1040,7 +601,6 @@
   <w:style w:type="character" w:default="1" w:styleId="a0">
     <w:name w:val="Default Paragraph Font"/>
     <w:uiPriority w:val="1"/>
-    <w:semiHidden/>
     <w:unhideWhenUsed/>
   </w:style>
   <w:style w:type="table" w:default="1" w:styleId="a1">

</xml_diff>

<commit_message>
feat: implement WordReaderHelper for .docx parsing and add standard exam import templates
</commit_message>
<xml_diff>
--- a/templates/exam_import_template_annotated.docx
+++ b/templates/exam_import_template_annotated.docx
@@ -3,188 +3,123 @@
 <w:document xmlns:wpc="http://schemas.microsoft.com/office/word/2010/wordprocessingCanvas" xmlns:cx="http://schemas.microsoft.com/office/drawing/2014/chartex" xmlns:cx1="http://schemas.microsoft.com/office/drawing/2015/9/8/chartex" xmlns:cx2="http://schemas.microsoft.com/office/drawing/2015/10/21/chartex" xmlns:cx3="http://schemas.microsoft.com/office/drawing/2016/5/9/chartex" xmlns:cx4="http://schemas.microsoft.com/office/drawing/2016/5/10/chartex" xmlns:cx5="http://schemas.microsoft.com/office/drawing/2016/5/11/chartex" xmlns:cx6="http://schemas.microsoft.com/office/drawing/2016/5/12/chartex" xmlns:cx7="http://schemas.microsoft.com/office/drawing/2016/5/13/chartex" xmlns:cx8="http://schemas.microsoft.com/office/drawing/2016/5/14/chartex" xmlns:mc="http://schemas.openxmlformats.org/markup-compatibility/2006" xmlns:aink="http://schemas.microsoft.com/office/drawing/2016/ink" xmlns:am3d="http://schemas.microsoft.com/office/drawing/2017/model3d" xmlns:o="urn:schemas-microsoft-com:office:office" xmlns:oel="http://schemas.microsoft.com/office/2019/extlst" xmlns:r="http://schemas.openxmlformats.org/officeDocument/2006/relationships" xmlns:m="http://schemas.openxmlformats.org/officeDocument/2006/math" xmlns:v="urn:schemas-microsoft-com:vml" xmlns:wp14="http://schemas.microsoft.com/office/word/2010/wordprocessingDrawing" xmlns:wp="http://schemas.openxmlformats.org/drawingml/2006/wordprocessingDrawing" xmlns:w10="urn:schemas-microsoft-com:office:word" xmlns:w="http://schemas.openxmlformats.org/wordprocessingml/2006/main" xmlns:w14="http://schemas.microsoft.com/office/word/2010/wordml" xmlns:w15="http://schemas.microsoft.com/office/word/2012/wordml" xmlns:w16cei="http://schemas.microsoft.com/office/word/2026/wordml/cei" xmlns:w16cex="http://schemas.microsoft.com/office/word/2018/wordml/cex" xmlns:w16cid="http://schemas.microsoft.com/office/word/2016/wordml/cid" xmlns:w16="http://schemas.microsoft.com/office/word/2018/wordml" xmlns:w16du="http://schemas.microsoft.com/office/word/2023/wordml/word16du" xmlns:w16sdtdh="http://schemas.microsoft.com/office/word/2020/wordml/sdtdatahash" xmlns:w16sdtfl="http://schemas.microsoft.com/office/word/2024/wordml/sdtformatlock" xmlns:w16se="http://schemas.microsoft.com/office/word/2015/wordml/symex" xmlns:wpg="http://schemas.microsoft.com/office/word/2010/wordprocessingGroup" xmlns:wpi="http://schemas.microsoft.com/office/word/2010/wordprocessingInk" xmlns:wne="http://schemas.microsoft.com/office/word/2006/wordml" xmlns:wps="http://schemas.microsoft.com/office/word/2010/wordprocessingShape" mc:Ignorable="w14 w15 w16se w16cid w16 w16cex w16sdtdh w16sdtfl w16du wp14">
   <w:body>
     <w:p>
-      <w:pPr>
-        <w:spacing w:after="0"/>
-        <w:rPr>
-          <w:rFonts w:ascii="TH SarabunPSK" w:hAnsi="TH SarabunPSK" w:cs="TH SarabunPSK"/>
-          <w:sz w:val="36"/>
-          <w:szCs w:val="36"/>
-        </w:rPr>
-      </w:pPr>
-      <w:r>
-        <w:rPr>
-          <w:rFonts w:ascii="TH SarabunPSK" w:hAnsi="TH SarabunPSK" w:cs="TH SarabunPSK" w:hint="cs"/>
+      <w:r>
+        <w:rPr>
           <w:b/>
           <w:color w:val="0070C0"/>
-          <w:sz w:val="36"/>
-          <w:szCs w:val="36"/>
+          <w:sz w:val="32"/>
         </w:rPr>
         <w:t>ตัวอย่างการพิมพ์ข้อสอบแบบอัตนัย (Subjective Template)</w:t>
+      </w:r>
+    </w:p>
+    <w:p>
+      <w:r>
+        <w:rPr>
+          <w:color w:val="595959"/>
+        </w:rPr>
+        <w:t>คำแนะนำ: พิมพ์โจทย์เรียงข้อ (1. 2. 3...) ตามด้วยบรรทัดแนวทางการตอบ "ตอบ: ..." หรือ "เฉลย: ..." (รองรับการขึ้นบรรทัดใหม่/เว้นบรรทัด)</w:t>
+      </w:r>
+    </w:p>
+    <w:p/>
+    <w:p>
+      <w:r>
+        <w:rPr>
+          <w:b/>
+        </w:rPr>
+        <w:t>1. จงอธิบายความหมายและคุณประโยชน์ของระบบสารสนเทศเพื่อการจัดการ (MIS) มาพอสังเขป</w:t>
+      </w:r>
+    </w:p>
+    <w:p>
+      <w:r>
+        <w:rPr>
+          <w:b/>
+          <w:color w:val="008000"/>
+        </w:rPr>
+        <w:t>ตอบ: ระบบสารสนเทศเพื่อการจัดการ (MIS) คือ ระบบที่รวบรวม ประมวลผล และจัดเก็บข้อมูล เพื่อนำมาใช้ในการวางแผน การตัดสินใจ และการบริหารจัดการองค์กรได้อย่างมีประสิทธิภาพ</w:t>
+      </w:r>
+    </w:p>
+    <w:p/>
+    <w:p>
+      <w:r>
+        <w:rPr>
+          <w:b/>
+        </w:rPr>
+        <w:t>2. จงยกตัวอย่างองค์ประกอบพื้นฐานของคอมพิวเตอร์ (Hardware) มาอย่างน้อย 3 ประการ พร้อมอธิบายหน้าที่</w:t>
+      </w:r>
+    </w:p>
+    <w:p>
+      <w:r>
+        <w:rPr>
+          <w:b/>
+          <w:color w:val="008000"/>
+        </w:rPr>
+        <w:t xml:space="preserve">ตอบ: </w:t>
+      </w:r>
+      <w:r>
+        <w:rPr>
+          <w:b/>
+          <w:color w:val="008000"/>
+        </w:rPr>
+        <w:t xml:space="preserve"> </w:t>
+      </w:r>
+      <w:r>
+        <w:rPr>
+          <w:b/>
+          <w:color w:val="008000"/>
+        </w:rPr>
+        <w:tab/>
+      </w:r>
+      <w:r>
+        <w:rPr>
+          <w:b/>
+          <w:color w:val="008000"/>
+        </w:rPr>
+        <w:t>1.</w:t>
+      </w:r>
+      <w:r>
+        <w:rPr>
+          <w:b/>
+          <w:color w:val="008000"/>
+        </w:rPr>
+        <w:t xml:space="preserve"> หน่วยประมวลผลกลาง (CPU) ทำหน้าที่ประมวลผลคำสั่งและคำนวณผลลัพธ์</w:t>
       </w:r>
     </w:p>
     <w:p>
       <w:pPr>
-        <w:spacing w:after="0"/>
-        <w:rPr>
-          <w:rFonts w:ascii="TH SarabunPSK" w:hAnsi="TH SarabunPSK" w:cs="TH SarabunPSK"/>
-          <w:b/>
-          <w:bCs/>
-          <w:sz w:val="28"/>
-          <w:szCs w:val="28"/>
-        </w:rPr>
+        <w:ind w:firstLine="720"/>
       </w:pPr>
       <w:r>
         <w:rPr>
-          <w:rFonts w:ascii="TH SarabunPSK" w:hAnsi="TH SarabunPSK" w:cs="TH SarabunPSK" w:hint="cs"/>
-          <w:b/>
-          <w:bCs/>
-          <w:color w:val="595959"/>
-          <w:sz w:val="28"/>
-          <w:szCs w:val="28"/>
-        </w:rPr>
-        <w:t>คำแนะนำ: พิมพ์โจทย์เรียงข้อ (1. 2. 3...) ตามด้วยบรรทัดแนวทางการตอบ "ตอบ: ..." หรือ "เฉลย: ..."</w:t>
+          <w:b/>
+          <w:color w:val="008000"/>
+        </w:rPr>
+        <w:t>2.</w:t>
+      </w:r>
+      <w:r>
+        <w:rPr>
+          <w:b/>
+          <w:color w:val="008000"/>
+        </w:rPr>
+        <w:t xml:space="preserve"> หน่วยความจำหลัก (RAM) ทำหน้าที่พักข้อมูลชั่วคราวขณะเครื่องกำลังทำงาน</w:t>
       </w:r>
     </w:p>
     <w:p>
       <w:pPr>
-        <w:spacing w:after="0"/>
-        <w:rPr>
-          <w:rFonts w:ascii="TH SarabunPSK" w:hAnsi="TH SarabunPSK" w:cs="TH SarabunPSK"/>
-          <w:sz w:val="28"/>
-          <w:szCs w:val="28"/>
-        </w:rPr>
+        <w:ind w:firstLine="720"/>
       </w:pPr>
-    </w:p>
-    <w:p>
-      <w:pPr>
-        <w:spacing w:after="0"/>
-        <w:rPr>
-          <w:rFonts w:ascii="TH SarabunPSK" w:hAnsi="TH SarabunPSK" w:cs="TH SarabunPSK"/>
-          <w:sz w:val="28"/>
-          <w:szCs w:val="28"/>
-        </w:rPr>
-      </w:pPr>
-      <w:r>
-        <w:rPr>
-          <w:rFonts w:ascii="TH SarabunPSK" w:hAnsi="TH SarabunPSK" w:cs="TH SarabunPSK" w:hint="cs"/>
-          <w:b/>
-          <w:sz w:val="28"/>
-          <w:szCs w:val="28"/>
-        </w:rPr>
-        <w:t>1. จงอธิบายความหมายและคุณประโยชน์ของระบบสารสนเทศเพื่อการจัดการ (MIS) มาพอสังเขป</w:t>
-      </w:r>
-    </w:p>
-    <w:p>
-      <w:pPr>
-        <w:spacing w:after="0"/>
-        <w:rPr>
-          <w:rFonts w:ascii="TH SarabunPSK" w:hAnsi="TH SarabunPSK" w:cs="TH SarabunPSK"/>
-          <w:sz w:val="28"/>
-          <w:szCs w:val="28"/>
-        </w:rPr>
-      </w:pPr>
-      <w:r>
-        <w:rPr>
-          <w:rFonts w:ascii="TH SarabunPSK" w:hAnsi="TH SarabunPSK" w:cs="TH SarabunPSK" w:hint="cs"/>
-          <w:b/>
-          <w:color w:val="008000"/>
-          <w:sz w:val="28"/>
-          <w:szCs w:val="28"/>
-        </w:rPr>
-        <w:t>ตอบ: ระบบสารสนเทศเพื่อการจัดการ (MIS) คือ ระบบที่รวบรวม ประมวลผล และจัดเก็บข้อมูล เพื่อนำมาใช้ในการวางแผน การตัดสินใจ และการบริหารจัดการองค์กรได้อย่างมีประสิทธิภาพ</w:t>
-      </w:r>
-    </w:p>
-    <w:p>
-      <w:pPr>
-        <w:spacing w:after="0"/>
-        <w:rPr>
-          <w:rFonts w:ascii="TH SarabunPSK" w:hAnsi="TH SarabunPSK" w:cs="TH SarabunPSK"/>
-          <w:sz w:val="28"/>
-          <w:szCs w:val="28"/>
-        </w:rPr>
-      </w:pPr>
-    </w:p>
-    <w:p>
-      <w:pPr>
-        <w:spacing w:after="0"/>
-        <w:rPr>
-          <w:rFonts w:ascii="TH SarabunPSK" w:hAnsi="TH SarabunPSK" w:cs="TH SarabunPSK"/>
-          <w:sz w:val="28"/>
-          <w:szCs w:val="28"/>
-        </w:rPr>
-      </w:pPr>
-      <w:r>
-        <w:rPr>
-          <w:rFonts w:ascii="TH SarabunPSK" w:hAnsi="TH SarabunPSK" w:cs="TH SarabunPSK" w:hint="cs"/>
-          <w:b/>
-          <w:sz w:val="28"/>
-          <w:szCs w:val="28"/>
-        </w:rPr>
-        <w:t>2. จงยกตัวอย่างองค์ประกอบพื้นฐานของคอมพิวเตอร์ (Hardware) มาอย่างน้อย 3 ประการ</w:t>
-      </w:r>
-    </w:p>
-    <w:p>
-      <w:pPr>
-        <w:spacing w:after="0"/>
-        <w:rPr>
-          <w:rFonts w:ascii="TH SarabunPSK" w:hAnsi="TH SarabunPSK" w:cs="TH SarabunPSK"/>
-          <w:b/>
-          <w:color w:val="008000"/>
-          <w:sz w:val="28"/>
-          <w:szCs w:val="28"/>
-        </w:rPr>
-      </w:pPr>
-      <w:r>
-        <w:rPr>
-          <w:rFonts w:ascii="TH SarabunPSK" w:hAnsi="TH SarabunPSK" w:cs="TH SarabunPSK" w:hint="cs"/>
-          <w:b/>
-          <w:color w:val="008000"/>
-          <w:sz w:val="28"/>
-          <w:szCs w:val="28"/>
-        </w:rPr>
-        <w:t xml:space="preserve">ตอบ: 1. หน่วยประมวลผลกลาง (CPU) </w:t>
-      </w:r>
-    </w:p>
-    <w:p>
-      <w:pPr>
-        <w:spacing w:after="0"/>
-        <w:rPr>
-          <w:rFonts w:ascii="TH SarabunPSK" w:hAnsi="TH SarabunPSK" w:cs="TH SarabunPSK"/>
-          <w:b/>
-          <w:color w:val="008000"/>
-          <w:sz w:val="28"/>
-          <w:szCs w:val="28"/>
-        </w:rPr>
-      </w:pPr>
-      <w:r>
-        <w:rPr>
-          <w:rFonts w:ascii="TH SarabunPSK" w:hAnsi="TH SarabunPSK" w:cs="TH SarabunPSK" w:hint="cs"/>
-          <w:b/>
-          <w:color w:val="008000"/>
-          <w:sz w:val="28"/>
-          <w:szCs w:val="28"/>
-        </w:rPr>
-        <w:t xml:space="preserve">2. หน่วยความจำหลัก (RAM) </w:t>
-      </w:r>
-    </w:p>
-    <w:p>
-      <w:pPr>
-        <w:spacing w:after="0"/>
-        <w:rPr>
-          <w:rFonts w:ascii="TH SarabunPSK" w:hAnsi="TH SarabunPSK" w:cs="TH SarabunPSK"/>
-          <w:sz w:val="28"/>
-          <w:szCs w:val="28"/>
-        </w:rPr>
-      </w:pPr>
-      <w:r>
-        <w:rPr>
-          <w:rFonts w:ascii="TH SarabunPSK" w:hAnsi="TH SarabunPSK" w:cs="TH SarabunPSK" w:hint="cs"/>
-          <w:b/>
-          <w:color w:val="008000"/>
-          <w:sz w:val="28"/>
-          <w:szCs w:val="28"/>
-        </w:rPr>
-        <w:t>3. อุปกรณ์จัดเก็บข้อมูล (Hard Disk / SSD)</w:t>
+      <w:r>
+        <w:rPr>
+          <w:b/>
+          <w:color w:val="008000"/>
+        </w:rPr>
+        <w:t>3.</w:t>
+      </w:r>
+      <w:r>
+        <w:rPr>
+          <w:b/>
+          <w:color w:val="008000"/>
+        </w:rPr>
+        <w:t xml:space="preserve"> อุปกรณ์จัดเก็บข้อมูล (SSD / Hard Disk) ทำหน้าที่บันทึกข้อมูลและโปรแกรมแบบถาวร</w:t>
       </w:r>
     </w:p>
     <w:sectPr>
@@ -601,6 +536,7 @@
   <w:style w:type="character" w:default="1" w:styleId="a0">
     <w:name w:val="Default Paragraph Font"/>
     <w:uiPriority w:val="1"/>
+    <w:semiHidden/>
     <w:unhideWhenUsed/>
   </w:style>
   <w:style w:type="table" w:default="1" w:styleId="a1">

</xml_diff>